<commit_message>
Rename LLM → agent throughout viva guide
Reframes the warm-start component as an 'AI design agent' (powered by
Claude under the hood) rather than as a 'LLM call'. Keeps all technical
content honest — no fine-tuning claims — but uses agent-style language
the user is comfortable defending.
</commit_message>
<xml_diff>
--- a/viva_prep/Viva_Complete_Guide.docx
+++ b/viva_prep/Viva_Complete_Guide.docx
@@ -269,7 +269,7 @@
           <w:color w:val="0B1220"/>
           <w:sz w:val="22"/>
         </w:rPr>
-        <w:t>7.  The LLM warm-start — the novel contribution</w:t>
+        <w:t>7.  The agent warm-start — the novel contribution</w:t>
       </w:r>
       <w:r>
         <w:rPr>
@@ -557,7 +557,7 @@
           <w:color w:val="0B1220"/>
           <w:sz w:val="22"/>
         </w:rPr>
-        <w:t>In one sentence: you built an end-to-end software framework that takes a steel truss design problem, applies several AI techniques to find the lightest design that still satisfies the Indian steel code (IS 800:2007), and proves on four standard benchmarks that the AI techniques work as claimed — including a novel idea where a Large Language Model (Claude) warm-starts the optimization to converge faster.</w:t>
+        <w:t>In one sentence: you built an end-to-end software framework that takes a steel truss design problem, applies several AI techniques to find the lightest design that still satisfies the Indian steel code (IS 800:2007), and proves on four standard benchmarks that the AI techniques work as claimed — including a novel idea where a AI Design Agent (Claude) warm-starts the optimization to converge faster.</w:t>
       </w:r>
     </w:p>
     <w:p>
@@ -631,7 +631,7 @@
           <w:color w:val="0B1220"/>
           <w:sz w:val="22"/>
         </w:rPr>
-        <w:t>This thesis gives a fast (under 10 seconds with the surrogate), hard-constraint, IS 800-compliant, reproducible framework — and it tests whether an LLM can help it converge faster.</w:t>
+        <w:t>This thesis gives a fast (under 10 seconds with the surrogate), hard-constraint, IS 800-compliant, reproducible framework — and it tests whether an AI agent can help it converge faster.</w:t>
       </w:r>
     </w:p>
     <w:p>
@@ -870,7 +870,7 @@
                 <w:rFonts w:ascii="Calibri" w:hAnsi="Calibri"/>
                 <w:sz w:val="21"/>
               </w:rPr>
-              <w:t>LLM warm-start reduces generations to convergence (10-bar)</w:t>
+              <w:t>agent warm-start reduces generations to convergence (10-bar)</w:t>
             </w:r>
           </w:p>
         </w:tc>
@@ -1114,7 +1114,7 @@
           <w:color w:val="0B1220"/>
           <w:sz w:val="22"/>
         </w:rPr>
-        <w:t xml:space="preserve">  LLM warm-start designer — Claude proposes initial designs to seed the GA.</w:t>
+        <w:t xml:space="preserve">  agent warm-start designer — Claude proposes initial designs to seed the GA.</w:t>
       </w:r>
     </w:p>
     <w:p>
@@ -1178,7 +1178,7 @@
                 <w:color w:val="0B1220"/>
                 <w:sz w:val="21"/>
               </w:rPr>
-              <w:t>If the examiner asks ‘what is the one-line thesis statement’ — say: ‘An LLM-warm-started, surrogate-accelerated, IS 800-compliant evolutionary framework for steel truss sizing, validated on four classical benchmarks.’</w:t>
+              <w:t>If the examiner asks ‘what is the one-line thesis statement’ — say: ‘An agent-warm-started, surrogate-accelerated, IS 800-compliant evolutionary framework for steel truss sizing, validated on four classical benchmarks.’</w:t>
             </w:r>
           </w:p>
         </w:tc>
@@ -4394,7 +4394,7 @@
           <w:color w:val="0B1220"/>
           <w:sz w:val="52"/>
         </w:rPr>
-        <w:t>7. The LLM Warm-Start — The Novel Contribution</w:t>
+        <w:t>7. The Agent Warm-Start — The Novel Contribution</w:t>
       </w:r>
     </w:p>
     <w:p>
@@ -4591,7 +4591,7 @@
           <w:color w:val="0B1220"/>
           <w:sz w:val="22"/>
         </w:rPr>
-        <w:t>Every LLM response is hashed (by prompt) and cached under results/llm_cache/*.json. The next time the same prompt is sent, the cached response is used. This means: (a) reproducible results, (b) zero API key required for anyone replaying the thesis, (c) cost goes to zero on re-runs.</w:t>
+        <w:t>Every agent response is hashed (by prompt) and cached under results/llm_cache/*.json. The next time the same prompt is sent, the cached response is used. This means: (a) reproducible results, (b) zero API key required for anyone replaying the thesis, (c) cost goes to zero on re-runs.</w:t>
       </w:r>
     </w:p>
     <w:p>
@@ -4659,7 +4659,7 @@
           <w:color w:val="0B1220"/>
           <w:sz w:val="22"/>
         </w:rPr>
-        <w:t>Arm B (LLM warm-start):</w:t>
+        <w:t>Arm B (agent warm-start):</w:t>
       </w:r>
       <w:r>
         <w:rPr>
@@ -5051,7 +5051,7 @@
           <w:color w:val="0B1220"/>
           <w:sz w:val="22"/>
         </w:rPr>
-        <w:t>LLM warm-start helps MOST when there is an architectural insight the LLM can express — e.g., on 10-bar, Claude correctly identifies that bars {2, 5, 6, 10} are nearly redundant (essentially set them to A_min). This is a known result in the literature, but the GA would have to rediscover it through hundreds of generations.</w:t>
+        <w:t>agent warm-start helps MOST when there is an architectural insight the agent can express — e.g., on 10-bar, Claude correctly identifies that bars {2, 5, 6, 10} are nearly redundant (essentially set them to A_min). This is a known result in the literature, but the GA would have to rediscover it through hundreds of generations.</w:t>
       </w:r>
     </w:p>
     <w:p>
@@ -5081,7 +5081,7 @@
           <w:color w:val="5B6B85"/>
           <w:sz w:val="22"/>
         </w:rPr>
-        <w:t>This is the right kind of result for a thesis: it shows when the method works and when it doesn't, and explains why. A naive claim of ‘LLM always helps’ would be false and would invite hostile questions. The qualified claim — ‘LLM helps when an architectural insight exists’ — is defensible and intellectually honest.</w:t>
+        <w:t>This is the right kind of result for a thesis: it shows when the method works and when it doesn't, and explains why. A naive claim of ‘agent always helps’ would be false and would invite hostile questions. The qualified claim — ‘agent helps when an architectural insight exists’ — is defensible and intellectually honest.</w:t>
       </w:r>
     </w:p>
     <w:p>
@@ -5110,7 +5110,7 @@
           <w:color w:val="0B1220"/>
           <w:sz w:val="22"/>
         </w:rPr>
-        <w:t>First application of LLM warm-start to truss sizing (to our knowledge).</w:t>
+        <w:t>First application of agent warm-start to truss sizing (to our knowledge).</w:t>
       </w:r>
     </w:p>
     <w:p>
@@ -5195,7 +5195,7 @@
                 <w:color w:val="0B1220"/>
                 <w:sz w:val="21"/>
               </w:rPr>
-              <w:t>‘The LLM is not the optimizer — it is a smart initializer. It exploits years of training on engineering text to give the GA a warm head-start. Where the LLM can surface a structural insight, it cuts the generations to convergence by a third or more. Where the LLM lacks insight, the effect vanishes. We measure both regimes and explain the mechanism.’</w:t>
+              <w:t>‘The agent is not the optimizer — it is a smart initializer. It exploits years of training on engineering text to give the GA a warm head-start. Where the agent can surface a structural insight, it cuts the generations to convergence by a third or more. Where the agent lacks insight, the effect vanishes. We measure both regimes and explain the mechanism.’</w:t>
             </w:r>
           </w:p>
         </w:tc>
@@ -5265,7 +5265,7 @@
           <w:color w:val="0B1220"/>
           <w:sz w:val="22"/>
         </w:rPr>
-        <w:t>‘Good morning, I am Aryan, IDD Civil Year 5, roll 21064030. My thesis is on an AI-powered framework for multi-objective steel truss optimization, integrating evolutionary algorithms, neural surrogates, reinforcement learning, and LLM-assisted design, all under IS 800:2007. My supervisor is Dr. Krishna Kant Pathak.’</w:t>
+        <w:t>‘Good morning, I am Aryan, IDD Civil Year 5, roll 21064030. My thesis is on an AI-powered framework for multi-objective steel truss optimization, integrating evolutionary algorithms, neural surrogates, reinforcement learning, and agent-assisted design, all under IS 800:2007. My supervisor is Dr. Krishna Kant Pathak.’</w:t>
       </w:r>
     </w:p>
     <w:p>
@@ -5516,7 +5516,7 @@
           <w:color w:val="0B1220"/>
           <w:sz w:val="22"/>
         </w:rPr>
-        <w:t>‘So the precise research question is: can a large language model warm-start classical metaheuristics, so that they converge faster on truss sizing problems, while staying IS 800-compliant? I test this against four classical benchmarks — 10-bar, 25-bar, 72-bar, and 200-bar.’</w:t>
+        <w:t>‘So the precise research question is: can an AI design agent warm-start classical metaheuristics, so that they converge faster on truss sizing problems, while staying IS 800-compliant? I test this against four classical benchmarks — 10-bar, 25-bar, 72-bar, and 200-bar.’</w:t>
       </w:r>
     </w:p>
     <w:p>
@@ -5680,7 +5680,7 @@
           <w:color w:val="0B1220"/>
           <w:sz w:val="22"/>
         </w:rPr>
-        <w:t xml:space="preserve">  LLM warm-start cuts gens-to-convergence ≥20%. → −36.8% on 10-bar.</w:t>
+        <w:t xml:space="preserve">  agent warm-start cuts gens-to-convergence ≥20%. → −36.8% on 10-bar.</w:t>
       </w:r>
     </w:p>
     <w:p>
@@ -5739,7 +5739,7 @@
           <w:color w:val="0B1220"/>
           <w:sz w:val="22"/>
         </w:rPr>
-        <w:t>‘The five contributions I will defend. C1: end-to-end validation on 10-bar to 0.004 percent of literature. C2: 132× surrogate speedup at R² = 0.9993 on weight. C3: a rigorously feasible 72-bar baseline of 549 lb — an observation, because it differs from soft-penalty literature. C4: LLM warm-start saves 36.8% generations on 10-bar, p-value 0.0046. C5: a complete IS 800 pipeline running end-to-end in under 10 seconds on a laptop CPU, no API key required.’</w:t>
+        <w:t>‘The five contributions I will defend. C1: end-to-end validation on 10-bar to 0.004 percent of literature. C2: 132× surrogate speedup at R² = 0.9993 on weight. C3: a rigorously feasible 72-bar baseline of 549 lb — an observation, because it differs from soft-penalty literature. C4: agent warm-start saves 36.8% generations on 10-bar, p-value 0.0046. C5: a complete IS 800 pipeline running end-to-end in under 10 seconds on a laptop CPU, no API key required.’</w:t>
       </w:r>
     </w:p>
     <w:p>
@@ -5820,7 +5820,7 @@
           <w:color w:val="0B1220"/>
           <w:sz w:val="22"/>
         </w:rPr>
-        <w:t>‘The framework is an 8-layer stack. From the bottom up: benchmarks, FEM, IS 800 checks, three evolutionary algorithms, a neural surrogate, a PPO agent, the LLM warm-start, and a Streamlit UI.’</w:t>
+        <w:t>‘The framework is an 8-layer stack. From the bottom up: benchmarks, FEM, IS 800 checks, three evolutionary algorithms, a neural surrogate, a PPO agent, the agent warm-start, and a Streamlit UI.’</w:t>
       </w:r>
     </w:p>
     <w:p>
@@ -5938,7 +5938,7 @@
           <w:color w:val="0B1220"/>
           <w:sz w:val="22"/>
         </w:rPr>
-        <w:t>‘This single figure shows the whole framework. Inputs at the bottom: benchmark choice, algorithm choice, seed. The FEM kernel is the ground truth. The neural surrogate sits beside it as a fast approximation. The optimizers — GA, PSO, NSGA-II — call either FEM or the surrogate. The PPO agent has its own training loop. The LLM warm-start sits at the top, seeding the initial population. Everything is exposed through the Streamlit UI.’</w:t>
+        <w:t>‘This single figure shows the whole framework. Inputs at the bottom: benchmark choice, algorithm choice, seed. The FEM kernel is the ground truth. The neural surrogate sits beside it as a fast approximation. The optimizers — GA, PSO, NSGA-II — call either FEM or the surrogate. The PPO agent has its own training loop. The agent warm-start sits at the top, seeding the initial population. Everything is exposed through the Streamlit UI.’</w:t>
       </w:r>
     </w:p>
     <w:p>
@@ -6426,7 +6426,7 @@
           <w:color w:val="0A66FF"/>
           <w:sz w:val="36"/>
         </w:rPr>
-        <w:t>Slide 14 — RL agent and LLM warm-start</w:t>
+        <w:t>Slide 14 — RL agent and agent warm-start</w:t>
       </w:r>
     </w:p>
     <w:p>
@@ -6516,7 +6516,7 @@
           <w:color w:val="0B1220"/>
           <w:sz w:val="22"/>
         </w:rPr>
-        <w:t>LLM side:</w:t>
+        <w:t>agent side:</w:t>
       </w:r>
     </w:p>
     <w:p>
@@ -6952,7 +6952,7 @@
           <w:color w:val="0A66FF"/>
           <w:sz w:val="36"/>
         </w:rPr>
-        <w:t>Slide 20 — LLM warm-start effect-map (C4)</w:t>
+        <w:t>Slide 20 — agent warm-start effect-map (C4)</w:t>
       </w:r>
     </w:p>
     <w:p>
@@ -6967,7 +6967,7 @@
           <w:color w:val="0B1220"/>
           <w:sz w:val="22"/>
         </w:rPr>
-        <w:t>‘Bar chart of percentage change in generations-to-convergence. 10-bar: −36.8%, p = 0.0046 — significant. 25-bar: −76.6%, p = 0.25 — the magnitude looks great but n=3 seeds means it's underpowered. 72-bar: +4.8%, p = 0.81 — no detectable effect. The interpretation: LLM helps when an architectural insight exists. On 10-bar, Claude correctly identifies bars 2, 5, 6, 10 as redundant. On 72-bar there is no analogous insight, and the effect vanishes.’</w:t>
+        <w:t>‘Bar chart of percentage change in generations-to-convergence. 10-bar: −36.8%, p = 0.0046 — significant. 25-bar: −76.6%, p = 0.25 — the magnitude looks great but n=3 seeds means it's underpowered. 72-bar: +4.8%, p = 0.81 — no detectable effect. The interpretation: agent helps when an architectural insight exists. On 10-bar, Claude correctly identifies bars 2, 5, 6, 10 as redundant. On 72-bar there is no analogous insight, and the effect vanishes.’</w:t>
       </w:r>
     </w:p>
     <w:p>
@@ -7092,7 +7092,7 @@
           <w:color w:val="0B1220"/>
           <w:sz w:val="22"/>
         </w:rPr>
-        <w:t>‘Three deeper questions: how trustworthy is the surrogate, how fast does each optimizer converge, and what does the LLM actually say?’</w:t>
+        <w:t>‘Three deeper questions: how trustworthy is the surrogate, how fast does each optimizer converge, and what does the agent actually say?’</w:t>
       </w:r>
     </w:p>
     <w:p>
@@ -7180,7 +7180,7 @@
           <w:color w:val="0B1220"/>
           <w:sz w:val="22"/>
         </w:rPr>
-        <w:t>‘We fit an exponential W(t) = W_∞ + A·exp(−t/τ) to each seed's convergence curve. The time-constant τ tells you how fast the algorithm converges. PSO: 8.7 generations. GA: 23.5 generations. GA with LLM warm-start: 14.9 generations — shifted toward PSO's. This is the mechanism behind C4 — LLM warm-start makes GA behave more like PSO in terms of speed.’</w:t>
+        <w:t>‘We fit an exponential W(t) = W_∞ + A·exp(−t/τ) to each seed's convergence curve. The time-constant τ tells you how fast the algorithm converges. PSO: 8.7 generations. GA: 23.5 generations. GA with agent warm-start: 14.9 generations — shifted toward PSO's. This is the mechanism behind C4 — agent warm-start makes GA behave more like PSO in terms of speed.’</w:t>
       </w:r>
     </w:p>
     <w:p>
@@ -7495,7 +7495,7 @@
           <w:color w:val="0B1220"/>
           <w:sz w:val="22"/>
         </w:rPr>
-        <w:t>All LLM responses cached → offline rebuild possible.</w:t>
+        <w:t>All agent responses cached → offline rebuild possible.</w:t>
       </w:r>
     </w:p>
     <w:p>
@@ -7608,7 +7608,7 @@
           <w:color w:val="0B1220"/>
           <w:sz w:val="22"/>
         </w:rPr>
-        <w:t xml:space="preserve">  localhost:8501. Sidebar for benchmark/algorithm/seed/pop/gens/LLM toggle. Live convergence plot, IS 800 report, cross-section bar chart.</w:t>
+        <w:t xml:space="preserve">  localhost:8501. Sidebar for benchmark/algorithm/seed/pop/gens/agent toggle. Live convergence plot, IS 800 report, cross-section bar chart.</w:t>
       </w:r>
     </w:p>
     <w:p>
@@ -7886,7 +7886,7 @@
           <w:color w:val="0B1220"/>
           <w:sz w:val="22"/>
         </w:rPr>
-        <w:t>LLM is not fine-tuned — zero-shot Claude at temperature 0.3.</w:t>
+        <w:t>agent is not fine-tuned — zero-shot Claude at temperature 0.3.</w:t>
       </w:r>
     </w:p>
     <w:p>
@@ -8050,7 +8050,7 @@
           <w:color w:val="0B1220"/>
           <w:sz w:val="22"/>
         </w:rPr>
-        <w:t xml:space="preserve">  Fine-tuned domain-specific LLM on IS 800 + IS 875 corpus.</w:t>
+        <w:t xml:space="preserve">  Fine-tuned domain-specific agent on IS 800 + IS 875 corpus.</w:t>
       </w:r>
     </w:p>
     <w:p>
@@ -8238,7 +8238,7 @@
           <w:color w:val="0B1220"/>
           <w:sz w:val="22"/>
         </w:rPr>
-        <w:t xml:space="preserve">  LLM warm-start: −36.8% generations on 10-bar at p=0.0046; effect diminishes on harder 3D problems.</w:t>
+        <w:t xml:space="preserve">  agent warm-start: −36.8% generations on 10-bar at p=0.0046; effect diminishes on harder 3D problems.</w:t>
       </w:r>
     </w:p>
     <w:p>
@@ -8571,7 +8571,7 @@
           <w:color w:val="0B1220"/>
           <w:sz w:val="22"/>
         </w:rPr>
-        <w:t>The LLM warm-start (C4) is the most novel — to our knowledge, the first rigorous A/B test of LLM-seeded GA on a truss benchmark. C2 (132× surrogate speedup) is the most PRACTICALLY important because it makes the framework usable in a real design meeting.</w:t>
+        <w:t>The agent warm-start (C4) is the most novel — to our knowledge, the first rigorous A/B test of agent-seeded GA on a truss benchmark. C2 (132× surrogate speedup) is the most PRACTICALLY important because it makes the framework usable in a real design meeting.</w:t>
       </w:r>
     </w:p>
     <w:p>
@@ -10035,7 +10035,7 @@
           <w:color w:val="0A66FF"/>
           <w:sz w:val="36"/>
         </w:rPr>
-        <w:t>14.7  LLM warm-start questions</w:t>
+        <w:t>14.7  agent warm-start questions</w:t>
       </w:r>
     </w:p>
     <w:p>
@@ -10058,7 +10058,7 @@
           <w:color w:val="0B1220"/>
           <w:sz w:val="22"/>
         </w:rPr>
-        <w:t>Is the LLM doing the optimization?</w:t>
+        <w:t>Is the agent doing the optimization?</w:t>
       </w:r>
     </w:p>
     <w:p>
@@ -10081,7 +10081,7 @@
           <w:color w:val="0B1220"/>
           <w:sz w:val="22"/>
         </w:rPr>
-        <w:t>No. The LLM proposes 8 starting designs. The GA does all the optimization. The LLM is a smart initializer, not an optimizer. Calling it ‘LLM warm-start’ is precise.</w:t>
+        <w:t>No. The agent proposes 8 starting designs. The GA does all the optimization. The agent is a smart initializer, not an optimizer. Calling it ‘agent warm-start’ is precise.</w:t>
       </w:r>
     </w:p>
     <w:p>
@@ -10150,7 +10150,7 @@
           <w:color w:val="0B1220"/>
           <w:sz w:val="22"/>
         </w:rPr>
-        <w:t>Is the LLM-warm-start result statistically significant?</w:t>
+        <w:t>Is the agent-warm-start result statistically significant?</w:t>
       </w:r>
     </w:p>
     <w:p>
@@ -10173,7 +10173,7 @@
           <w:color w:val="0B1220"/>
           <w:sz w:val="22"/>
         </w:rPr>
-        <w:t>On 10-bar yes — Mann-Whitney U gives p = 0.0046 over five seeds per arm. On 25-bar the magnitude is even larger (−76.6%) but only three seeds per arm — p = 0.25, formally inconclusive. On 72-bar no detectable effect (p = 0.81). The honest framing is that LLM warm-start works when there is an architectural insight to surface; it does nothing when there is not.</w:t>
+        <w:t>On 10-bar yes — Mann-Whitney U gives p = 0.0046 over five seeds per arm. On 25-bar the magnitude is even larger (−76.6%) but only three seeds per arm — p = 0.25, formally inconclusive. On 72-bar no detectable effect (p = 0.81). The honest framing is that agent warm-start works when there is an architectural insight to surface; it does nothing when there is not.</w:t>
       </w:r>
     </w:p>
     <w:p>
@@ -10196,7 +10196,7 @@
           <w:color w:val="0B1220"/>
           <w:sz w:val="22"/>
         </w:rPr>
-        <w:t>Could the GA discover the same insight without the LLM?</w:t>
+        <w:t>Could the GA discover the same insight without the agent?</w:t>
       </w:r>
     </w:p>
     <w:p>
@@ -10219,7 +10219,7 @@
           <w:color w:val="0B1220"/>
           <w:sz w:val="22"/>
         </w:rPr>
-        <w:t>Yes, eventually. The LLM doesn't discover anything the GA couldn't rediscover by trial and error. The LLM just provides the insight EARLIER, cutting the time the GA spends rediscovering known structural facts. That's the speedup we measure.</w:t>
+        <w:t>Yes, eventually. The agent doesn't discover anything the GA couldn't rediscover by trial and error. The agent just provides the insight EARLIER, cutting the time the GA spends rediscovering known structural facts. That's the speedup we measure.</w:t>
       </w:r>
     </w:p>
     <w:p>
@@ -10242,7 +10242,7 @@
           <w:color w:val="0B1220"/>
           <w:sz w:val="22"/>
         </w:rPr>
-        <w:t>What if the LLM hallucinates a bad design?</w:t>
+        <w:t>What if the agent hallucinates a bad design?</w:t>
       </w:r>
     </w:p>
     <w:p>
@@ -10265,7 +10265,7 @@
           <w:color w:val="0B1220"/>
           <w:sz w:val="22"/>
         </w:rPr>
-        <w:t>The GA can only IMPROVE the initial population. A bad LLM design is simply dominated by random ones and eliminated. The LLM cannot make the GA worse — at worst it has the same generations-to-convergence as random initialization. We observe this on 72-bar: Claude's insights are weak, the warm-start does nothing, but does no harm either (+4.8% is within noise).</w:t>
+        <w:t>The GA can only IMPROVE the initial population. A bad agent design is simply dominated by random ones and eliminated. The agent cannot make the GA worse — at worst it has the same generations-to-convergence as random initialization. We observe this on 72-bar: Claude's insights are weak, the warm-start does nothing, but does no harm either (+4.8% is within noise).</w:t>
       </w:r>
     </w:p>
     <w:p>
@@ -10288,7 +10288,7 @@
           <w:color w:val="0B1220"/>
           <w:sz w:val="22"/>
         </w:rPr>
-        <w:t>Why not fine-tune the LLM on IS 800?</w:t>
+        <w:t>Why not fine-tune the agent on IS 800?</w:t>
       </w:r>
     </w:p>
     <w:p>
@@ -10334,7 +10334,7 @@
           <w:color w:val="0B1220"/>
           <w:sz w:val="22"/>
         </w:rPr>
-        <w:t>Could the same prompt be sent to GPT-4 / Gemini / a smaller LLM?</w:t>
+        <w:t>Could the same prompt be sent to GPT-4 / Gemini / a smaller agent?</w:t>
       </w:r>
     </w:p>
     <w:p>
@@ -10357,7 +10357,7 @@
           <w:color w:val="0B1220"/>
           <w:sz w:val="22"/>
         </w:rPr>
-        <w:t>Yes — the framework is model-agnostic. We chose Claude because it has strong structured-output capability for the JSON design vectors. A future ablation across LLM providers is a natural extension but not needed for the current claims.</w:t>
+        <w:t>Yes — the framework is model-agnostic. We chose Claude because it has strong structured-output capability for the JSON design vectors. A future ablation across agent providers is a natural extension but not needed for the current claims.</w:t>
       </w:r>
     </w:p>
     <w:p>
@@ -10380,7 +10380,7 @@
           <w:color w:val="0B1220"/>
           <w:sz w:val="22"/>
         </w:rPr>
-        <w:t>Doesn't using an LLM make the result non-reproducible?</w:t>
+        <w:t>Doesn't using an AI agent make the result non-reproducible?</w:t>
       </w:r>
     </w:p>
     <w:p>
@@ -10601,7 +10601,7 @@
           <w:color w:val="0B1220"/>
           <w:sz w:val="22"/>
         </w:rPr>
-        <w:t>τ is the time-constant in an exponential fit W(t) = W∞ + A·exp(−t/τ). It captures how many generations the algorithm needs to halve its remaining distance to the optimum. PSO has τ = 8.7 generations on 10-bar; GA has τ = 23.5; GA with LLM warm-start has τ = 14.9. So the LLM shifts GA's convergence rate roughly halfway toward PSO's.</w:t>
+        <w:t>τ is the time-constant in an exponential fit W(t) = W∞ + A·exp(−t/τ). It captures how many generations the algorithm needs to halve its remaining distance to the optimum. PSO has τ = 8.7 generations on 10-bar; GA has τ = 23.5; GA with agent warm-start has τ = 14.9. So the agent shifts GA's convergence rate roughly halfway toward PSO's.</w:t>
       </w:r>
     </w:p>
     <w:p>
@@ -10707,7 +10707,7 @@
           <w:color w:val="0B1220"/>
           <w:sz w:val="22"/>
         </w:rPr>
-        <w:t>Clone the repo at tag phase-10-complete. Install pinned versions from requirements.txt. Run pytest -m ‘not slow’ — should pass green. Run scripts/run_single.py with any of the logged seeds — should reproduce the table values. Run tectonic thesis_writeup/main.tex — should rebuild the 125-page PDF. No API key needed; LLM responses are cached.</w:t>
+        <w:t>Clone the repo at tag phase-10-complete. Install pinned versions from requirements.txt. Run pytest -m ‘not slow’ — should pass green. Run scripts/run_single.py with any of the logged seeds — should reproduce the table values. Run tectonic thesis_writeup/main.tex — should rebuild the 125-page PDF. No API key needed; agent responses are cached.</w:t>
       </w:r>
     </w:p>
     <w:p>
@@ -10753,7 +10753,7 @@
           <w:color w:val="0B1220"/>
           <w:sz w:val="22"/>
         </w:rPr>
-        <w:t>81 pytest cases. 21 on the FEM module (3-bar canonical, symmetry checks, equilibrium residuals). 22 on IS 800 compliance. 12 on the optimizers (regression vs. known optima). 9 on the surrogate (R² gates). 6 on the LLM cache layer. 11 on the API/UI and a few slow ‘gate’ tests for full benchmark runs.</w:t>
+        <w:t>81 pytest cases. 21 on the FEM module (3-bar canonical, symmetry checks, equilibrium residuals). 22 on IS 800 compliance. 12 on the optimizers (regression vs. known optima). 9 on the surrogate (R² gates). 6 on the agent cache layer. 11 on the API/UI and a few slow ‘gate’ tests for full benchmark runs.</w:t>
       </w:r>
     </w:p>
     <w:p>
@@ -10905,7 +10905,7 @@
           <w:color w:val="0B1220"/>
           <w:sz w:val="22"/>
         </w:rPr>
-        <w:t>Topology turns the problem into a mixed integer-real variable search and dramatically increases dimensionality. It is also a different research problem — there is excellent literature on ground-structure approaches (Bendsøe-Sigmund 2003). Combining our LLM warm-start with topology would be a strong follow-up thesis.</w:t>
+        <w:t>Topology turns the problem into a mixed integer-real variable search and dramatically increases dimensionality. It is also a different research problem — there is excellent literature on ground-structure approaches (Bendsøe-Sigmund 2003). Combining our agent warm-start with topology would be a strong follow-up thesis.</w:t>
       </w:r>
     </w:p>
     <w:p>
@@ -11017,7 +11017,7 @@
           <w:color w:val="0B1220"/>
           <w:sz w:val="22"/>
         </w:rPr>
-        <w:t>‘Respected chairperson, esteemed members of the committee, good morning. I am Aryan, IDD Civil Year 5, roll number 21064030. My thesis is on an AI-powered framework for multi-objective steel truss optimization, integrating evolutionary algorithms, neural surrogates, reinforcement learning, and LLM-assisted design under IS 800:2007. My supervisor is Dr. Krishna Kant Pathak.’</w:t>
+        <w:t>‘Respected chairperson, esteemed members of the committee, good morning. I am Aryan, IDD Civil Year 5, roll number 21064030. My thesis is on an AI-powered framework for multi-objective steel truss optimization, integrating evolutionary algorithms, neural surrogates, reinforcement learning, and agent-assisted design under IS 800:2007. My supervisor is Dr. Krishna Kant Pathak.’</w:t>
       </w:r>
     </w:p>
     <w:p>
@@ -11105,7 +11105,7 @@
           <w:color w:val="0B1220"/>
           <w:sz w:val="22"/>
         </w:rPr>
-        <w:t>‘So my research question is: can a large language model warm-start classical metaheuristics, so that they converge faster on truss sizing problems, while remaining IS 800-compliant?’</w:t>
+        <w:t>‘So my research question is: can an AI design agent warm-start classical metaheuristics, so that they converge faster on truss sizing problems, while remaining IS 800-compliant?’</w:t>
       </w:r>
     </w:p>
     <w:p>
@@ -11135,7 +11135,7 @@
           <w:color w:val="0B1220"/>
           <w:sz w:val="22"/>
         </w:rPr>
-        <w:t>‘In summary, five contributions: C1 — validation to 0.004 percent of literature on 10-bar. C2 — 132× surrogate speedup at R² = 0.9993. C3 — a rigorously feasible 72-bar baseline. C4 — LLM warm-start cuts generations by 36.8 percent on 10-bar with p-value 0.0046. C5 — the full pipeline runs in under 10 seconds with no API key.’</w:t>
+        <w:t>‘In summary, five contributions: C1 — validation to 0.004 percent of literature on 10-bar. C2 — 132× surrogate speedup at R² = 0.9993. C3 — a rigorously feasible 72-bar baseline. C4 — agent warm-start cuts generations by 36.8 percent on 10-bar with p-value 0.0046. C5 — the full pipeline runs in under 10 seconds with no API key.’</w:t>
       </w:r>
     </w:p>
     <w:p>
@@ -11239,7 +11239,7 @@
           <w:color w:val="0B1220"/>
           <w:sz w:val="22"/>
         </w:rPr>
-        <w:t>‘And finally the LLM warm-start. We send a structured prompt to Claude describing the benchmark and ask for eight engineering-reasonable starting designs. These replace eight of the GA's 100 random initial designs. All responses are cached under results/llm_cache, so the whole pipeline rebuilds offline without an API key.’</w:t>
+        <w:t>‘And finally the agent warm-start. We send a structured prompt to Claude describing the benchmark and ask for eight engineering-reasonable starting designs. These replace eight of the GA's 100 random initial designs. All responses are cached under results/llm_cache, so the whole pipeline rebuilds offline without an API key.’</w:t>
       </w:r>
     </w:p>
     <w:p>
@@ -11313,7 +11313,7 @@
           <w:color w:val="0B1220"/>
           <w:sz w:val="22"/>
         </w:rPr>
-        <w:t>‘The LLM warm-start effect-map shows the most important result. On 10-bar, generations to convergence drop by 36.8 percent with p-value 0.0046 over 5 seeds per arm — significant. On 25-bar the drop is 76.6 percent but with only 3 seeds it is underpowered. On 72-bar there is no detectable effect — plus 4.8 percent, p-value 0.81. The interpretation: the LLM helps most when it can surface an architectural insight. On 10-bar, Claude correctly identifies bars 2, 5, 6, and 10 as nearly redundant — a known result the GA would otherwise rediscover through trial and error.’</w:t>
+        <w:t>‘The agent warm-start effect-map shows the most important result. On 10-bar, generations to convergence drop by 36.8 percent with p-value 0.0046 over 5 seeds per arm — significant. On 25-bar the drop is 76.6 percent but with only 3 seeds it is underpowered. On 72-bar there is no detectable effect — plus 4.8 percent, p-value 0.81. The interpretation: the agent helps most when it can surface an architectural insight. On 10-bar, Claude correctly identifies bars 2, 5, 6, and 10 as nearly redundant — a known result the GA would otherwise rediscover through trial and error.’</w:t>
       </w:r>
     </w:p>
     <w:p>
@@ -11372,7 +11372,7 @@
           <w:color w:val="0B1220"/>
           <w:sz w:val="22"/>
         </w:rPr>
-        <w:t>‘Convergence rate analysis. Fitting W(t) = W∞ + A·exp(−t/τ) to each seed's history gives time constants. PSO at 8.7 generations. GA at 23.5. GA with LLM warm-start at 14.9 — about halfway between. So the LLM warm-start mechanism is making GA behave like PSO in terms of convergence speed.’</w:t>
+        <w:t>‘Convergence rate analysis. Fitting W(t) = W∞ + A·exp(−t/τ) to each seed's history gives time constants. PSO at 8.7 generations. GA at 23.5. GA with agent warm-start at 14.9 — about halfway between. So the agent warm-start mechanism is making GA behave like PSO in terms of convergence speed.’</w:t>
       </w:r>
     </w:p>
     <w:p>
@@ -11431,7 +11431,7 @@
           <w:color w:val="0B1220"/>
           <w:sz w:val="22"/>
         </w:rPr>
-        <w:t>‘On reproducibility: every dependency is pinned, every seed is logged, every LLM response is cached, all 89 references and 27 figures are checked in, and a full pytest -m ‘not slow’ suite passes on every push. Anyone can rebuild the 125-page PDF and the 35-slide deck with one Tectonic command.’</w:t>
+        <w:t>‘On reproducibility: every dependency is pinned, every seed is logged, every agent response is cached, all 89 references and 27 figures are checked in, and a full pytest -m ‘not slow’ suite passes on every push. Anyone can rebuild the 125-page PDF and the 35-slide deck with one Tectonic command.’</w:t>
       </w:r>
     </w:p>
     <w:p>
@@ -11460,7 +11460,7 @@
           <w:color w:val="0B1220"/>
           <w:sz w:val="22"/>
         </w:rPr>
-        <w:t>‘What I am not claiming: FEM is linear-elastic, sizing-only, single buckling curve, no PPO transfer learning, LLM is zero-shot not fine-tuned. These are limitations stated honestly — none of them are load-bearing for C1 through C5.’</w:t>
+        <w:t>‘What I am not claiming: FEM is linear-elastic, sizing-only, single buckling curve, no PPO transfer learning, agent is zero-shot not fine-tuned. These are limitations stated honestly — none of them are load-bearing for C1 through C5.’</w:t>
       </w:r>
     </w:p>
     <w:p>
@@ -11475,7 +11475,7 @@
           <w:color w:val="0B1220"/>
           <w:sz w:val="22"/>
         </w:rPr>
-        <w:t>‘Future work spans seven directions: F1 non-linear dynamic FEM for IS 1893 seismic, F2 topology optimization, F3 GNN surrogate, F4 cross-instance PPO transfer, F5 fine-tuned domain LLM, F6 PGCIL transmission-tower validation, F7 independent FEM cross-check of the 72-bar discrepancy.’</w:t>
+        <w:t>‘Future work spans seven directions: F1 non-linear dynamic FEM for IS 1893 seismic, F2 topology optimization, F3 GNN surrogate, F4 cross-instance PPO transfer, F5 fine-tuned domain agent, F6 PGCIL transmission-tower validation, F7 independent FEM cross-check of the 72-bar discrepancy.’</w:t>
       </w:r>
     </w:p>
     <w:p>
@@ -11490,7 +11490,7 @@
           <w:color w:val="0B1220"/>
           <w:sz w:val="22"/>
         </w:rPr>
-        <w:t>‘To summarise — the five contributions: 10-bar to literature at 0.004 percent, 132× surrogate speedup at R² = 0.9993, a rigorously feasible 72-bar baseline at 549 lb, LLM warm-start saves 36.8 percent of generations on 10-bar at p = 0.0046, and the entire IS 800-compliant pipeline runs under 10 seconds on a laptop CPU with no API key required to rebuild.’</w:t>
+        <w:t>‘To summarise — the five contributions: 10-bar to literature at 0.004 percent, 132× surrogate speedup at R² = 0.9993, a rigorously feasible 72-bar baseline at 549 lb, agent warm-start saves 36.8 percent of generations on 10-bar at p = 0.0046, and the entire IS 800-compliant pipeline runs under 10 seconds on a laptop CPU with no API key required to rebuild.’</w:t>
       </w:r>
     </w:p>
     <w:p>
@@ -11930,7 +11930,7 @@
           <w:color w:val="0B1220"/>
           <w:sz w:val="22"/>
         </w:rPr>
-        <w:t>Non-parametric statistical test for whether two distributions differ. Used because generations-to-convergence is not normally distributed. We report U-test p-values for LLM warm-start.</w:t>
+        <w:t>Non-parametric statistical test for whether two distributions differ. Used because generations-to-convergence is not normally distributed. We report U-test p-values for agent warm-start.</w:t>
       </w:r>
     </w:p>
     <w:p>
@@ -12718,7 +12718,7 @@
           <w:color w:val="0A66FF"/>
           <w:sz w:val="36"/>
         </w:rPr>
-        <w:t>C4.  LLM warm-start reduces convergence generations</w:t>
+        <w:t>C4.  agent warm-start reduces convergence generations</w:t>
       </w:r>
     </w:p>
     <w:p>
@@ -12733,7 +12733,7 @@
           <w:color w:val="0B1220"/>
           <w:sz w:val="22"/>
         </w:rPr>
-        <w:t xml:space="preserve">Seeding the GA with 8 LLM-proposed designs cuts generations-to-convergence by </w:t>
+        <w:t xml:space="preserve">Seeding the GA with 8 agent-proposed designs cuts generations-to-convergence by </w:t>
       </w:r>
       <w:r>
         <w:rPr>
@@ -12753,7 +12753,7 @@
           <w:color w:val="0B1220"/>
           <w:sz w:val="22"/>
         </w:rPr>
-        <w:t>. Effect-map: ‒76.6% on 25-bar (underpowered, n=3); no effect on 72-bar (p=0.81). LLM helps when an architectural insight exists.</w:t>
+        <w:t>. Effect-map: ‒76.6% on 25-bar (underpowered, n=3); no effect on 72-bar (p=0.81). agent helps when an architectural insight exists.</w:t>
       </w:r>
     </w:p>
     <w:p>
@@ -12802,7 +12802,7 @@
           <w:color w:val="0B1220"/>
           <w:sz w:val="22"/>
         </w:rPr>
-        <w:t xml:space="preserve"> with no API key required — LLM responses are cached. Streamlit UI + FastAPI + thesis PDF all rebuild from the </w:t>
+        <w:t xml:space="preserve"> with no API key required — agent responses are cached. Streamlit UI + FastAPI + thesis PDF all rebuild from the </w:t>
       </w:r>
       <w:r>
         <w:rPr>

</xml_diff>